<commit_message>
Se actualiza el registro de PDH para que aparezca las horas pendiente y puedan ser seleccionadas, tambien se organiza detalles de cambio de turno permanente como que omita los dias con dobladas y se actualizan test de pruebas
</commit_message>
<xml_diff>
--- a/instructivos/regla de negocios de cada solicitud.docx
+++ b/instructivos/regla de negocios de cada solicitud.docx
@@ -1718,52 +1718,21 @@
           <w:bCs/>
         </w:rPr>
       </w:pPr>
-      <w:r>
-        <w:rPr>
-          <w:b/>
-          <w:bCs/>
+    </w:p>
+    <w:p>
+      <w:pPr>
+        <w:rPr>
+          <w:b/>
+          <w:bCs/>
+        </w:rPr>
+      </w:pPr>
+      <w:r>
+        <w:rPr>
+          <w:b/>
+          <w:bCs/>
+          <w:highlight w:val="yellow"/>
         </w:rPr>
         <w:lastRenderedPageBreak/>
-        <w:t>¿Quieres que iguale la doblada normal a la permanente en los faltantes (validar sanción del receptor, y reforzar el choque/doble-</w:t>
-      </w:r>
-      <w:proofErr w:type="spellStart"/>
-      <w:r>
-        <w:rPr>
-          <w:b/>
-          <w:bCs/>
-        </w:rPr>
-        <w:t>booking</w:t>
-      </w:r>
-      <w:proofErr w:type="spellEnd"/>
-      <w:r>
-        <w:rPr>
-          <w:b/>
-          <w:bCs/>
-        </w:rPr>
-        <w:t>)? Dime cuáles priorizamos y los implemento.</w:t>
-      </w:r>
-    </w:p>
-    <w:p>
-      <w:pPr>
-        <w:rPr>
-          <w:b/>
-          <w:bCs/>
-        </w:rPr>
-      </w:pPr>
-    </w:p>
-    <w:p>
-      <w:pPr>
-        <w:rPr>
-          <w:b/>
-          <w:bCs/>
-        </w:rPr>
-      </w:pPr>
-      <w:r>
-        <w:rPr>
-          <w:b/>
-          <w:bCs/>
-          <w:highlight w:val="yellow"/>
-        </w:rPr>
         <w:t>Regla de negocio de doblada permanente</w:t>
       </w:r>
       <w:r>
@@ -2137,7 +2106,6 @@
           <w:b/>
           <w:bCs/>
         </w:rPr>
-        <w:lastRenderedPageBreak/>
         <w:t>No domingos</w:t>
       </w:r>
       <w:r>
@@ -2202,6 +2170,7 @@
           <w:b/>
           <w:bCs/>
         </w:rPr>
+        <w:lastRenderedPageBreak/>
         <w:t>No repetir un día</w:t>
       </w:r>
       <w:r>
@@ -2648,7 +2617,6 @@
         </w:numPr>
       </w:pPr>
       <w:r>
-        <w:lastRenderedPageBreak/>
         <w:t>En </w:t>
       </w:r>
       <w:r>
@@ -2733,6 +2701,7 @@
           <w:b/>
           <w:bCs/>
         </w:rPr>
+        <w:lastRenderedPageBreak/>
         <w:t>⚠️</w:t>
       </w:r>
       <w:r>

</xml_diff>